<commit_message>
Include domain and hosting, and leave the service list open.
The 200 000 tenge offer now covers the domain and hosting. Service pages follow however many treatments the clinic names.

Co-authored-by: csgo.steam.15 <csgo.steam.15@bk.ru>
</commit_message>
<xml_diff>
--- a/public/KP-1029-oftalmologiya-almaty.docx
+++ b/public/KP-1029-oftalmologiya-almaty.docx
@@ -10,7 +10,6 @@
         <w:rPr>
           <w:rFonts w:ascii="Times New Roman" w:hAnsi="Times New Roman" w:eastAsia="Times New Roman"/>
           <w:b/>
-          <w:i w:val="0"/>
           <w:color w:val="0E7490"/>
           <w:sz w:val="22"/>
         </w:rPr>
@@ -25,7 +24,6 @@
         <w:rPr>
           <w:rFonts w:ascii="Times New Roman" w:hAnsi="Times New Roman" w:eastAsia="Times New Roman"/>
           <w:b/>
-          <w:i w:val="0"/>
           <w:color w:val="1C1915"/>
           <w:sz w:val="44"/>
         </w:rPr>
@@ -35,7 +33,6 @@
     <w:tbl>
       <w:tblPr>
         <w:tblW w:type="auto" w:w="0"/>
-        <w:tblLayout w:type="autofit"/>
         <w:tblLook w:firstColumn="1" w:firstRow="1" w:lastColumn="0" w:lastRow="0" w:noHBand="0" w:noVBand="1" w:val="04A0"/>
         <w:tblBorders>
           <w:top w:val="nil"/>
@@ -64,7 +61,6 @@
               <w:rPr>
                 <w:rFonts w:ascii="Times New Roman" w:hAnsi="Times New Roman" w:eastAsia="Times New Roman"/>
                 <w:b w:val="0"/>
-                <w:i w:val="0"/>
                 <w:color w:val="5C564E"/>
                 <w:sz w:val="22"/>
               </w:rPr>
@@ -80,13 +76,11 @@
           <w:p>
             <w:pPr>
               <w:spacing w:before="40" w:after="40"/>
-              <w:jc w:val="left"/>
             </w:pPr>
             <w:r>
               <w:rPr>
                 <w:rFonts w:ascii="Times New Roman" w:hAnsi="Times New Roman" w:eastAsia="Times New Roman"/>
                 <w:b/>
-                <w:i w:val="0"/>
                 <w:color w:val="1C1915"/>
                 <w:sz w:val="22"/>
               </w:rPr>
@@ -109,7 +103,6 @@
               <w:rPr>
                 <w:rFonts w:ascii="Times New Roman" w:hAnsi="Times New Roman" w:eastAsia="Times New Roman"/>
                 <w:b w:val="0"/>
-                <w:i w:val="0"/>
                 <w:color w:val="5C564E"/>
                 <w:sz w:val="22"/>
               </w:rPr>
@@ -125,13 +118,11 @@
           <w:p>
             <w:pPr>
               <w:spacing w:before="40" w:after="40"/>
-              <w:jc w:val="left"/>
             </w:pPr>
             <w:r>
               <w:rPr>
                 <w:rFonts w:ascii="Times New Roman" w:hAnsi="Times New Roman" w:eastAsia="Times New Roman"/>
                 <w:b/>
-                <w:i w:val="0"/>
                 <w:color w:val="1C1915"/>
                 <w:sz w:val="22"/>
               </w:rPr>
@@ -154,7 +145,6 @@
               <w:rPr>
                 <w:rFonts w:ascii="Times New Roman" w:hAnsi="Times New Roman" w:eastAsia="Times New Roman"/>
                 <w:b w:val="0"/>
-                <w:i w:val="0"/>
                 <w:color w:val="5C564E"/>
                 <w:sz w:val="22"/>
               </w:rPr>
@@ -170,13 +160,11 @@
           <w:p>
             <w:pPr>
               <w:spacing w:before="40" w:after="40"/>
-              <w:jc w:val="left"/>
             </w:pPr>
             <w:r>
               <w:rPr>
                 <w:rFonts w:ascii="Times New Roman" w:hAnsi="Times New Roman" w:eastAsia="Times New Roman"/>
                 <w:b/>
-                <w:i w:val="0"/>
                 <w:color w:val="1C1915"/>
                 <w:sz w:val="22"/>
               </w:rPr>
@@ -197,7 +185,6 @@
     <w:tbl>
       <w:tblPr>
         <w:tblW w:type="auto" w:w="0"/>
-        <w:tblLayout w:type="autofit"/>
         <w:tblLook w:firstColumn="1" w:firstRow="1" w:lastColumn="0" w:lastRow="0" w:noHBand="0" w:noVBand="1" w:val="04A0"/>
         <w:tblBorders>
           <w:top w:val="single" w:sz="4" w:space="0" w:color="E7E2D8"/>
@@ -217,7 +204,6 @@
           <w:tcPr>
             <w:tcW w:type="dxa" w:w="4933"/>
             <w:vAlign w:val="center"/>
-            <w:shd w:fill="FFFFFF" w:val="clear"/>
           </w:tcPr>
           <w:p>
             <w:pPr>
@@ -227,7 +213,6 @@
               <w:rPr>
                 <w:rFonts w:ascii="Times New Roman" w:hAnsi="Times New Roman" w:eastAsia="Times New Roman"/>
                 <w:b/>
-                <w:i w:val="0"/>
                 <w:color w:val="8A8378"/>
                 <w:sz w:val="20"/>
               </w:rPr>
@@ -239,7 +224,6 @@
           <w:tcPr>
             <w:tcW w:type="dxa" w:w="4933"/>
             <w:vAlign w:val="center"/>
-            <w:shd w:fill="FFFFFF" w:val="clear"/>
           </w:tcPr>
           <w:p>
             <w:pPr>
@@ -249,7 +233,6 @@
               <w:rPr>
                 <w:rFonts w:ascii="Times New Roman" w:hAnsi="Times New Roman" w:eastAsia="Times New Roman"/>
                 <w:b/>
-                <w:i w:val="0"/>
                 <w:color w:val="8A8378"/>
                 <w:sz w:val="20"/>
               </w:rPr>
@@ -263,7 +246,6 @@
           <w:tcPr>
             <w:tcW w:type="dxa" w:w="4933"/>
             <w:vAlign w:val="center"/>
-            <w:shd w:fill="FFFFFF" w:val="clear"/>
           </w:tcPr>
           <w:p>
             <w:pPr>
@@ -273,7 +255,6 @@
               <w:rPr>
                 <w:rFonts w:ascii="Times New Roman" w:hAnsi="Times New Roman" w:eastAsia="Times New Roman"/>
                 <w:b/>
-                <w:i w:val="0"/>
                 <w:color w:val="1C1915"/>
                 <w:sz w:val="52"/>
               </w:rPr>
@@ -285,7 +266,6 @@
           <w:tcPr>
             <w:tcW w:type="dxa" w:w="4933"/>
             <w:vAlign w:val="center"/>
-            <w:shd w:fill="FFFFFF" w:val="clear"/>
           </w:tcPr>
           <w:p>
             <w:pPr>
@@ -295,7 +275,6 @@
               <w:rPr>
                 <w:rFonts w:ascii="Times New Roman" w:hAnsi="Times New Roman" w:eastAsia="Times New Roman"/>
                 <w:b/>
-                <w:i w:val="0"/>
                 <w:color w:val="1C1915"/>
                 <w:sz w:val="52"/>
               </w:rPr>
@@ -309,7 +288,6 @@
           <w:tcPr>
             <w:tcW w:type="dxa" w:w="4933"/>
             <w:vAlign w:val="center"/>
-            <w:shd w:fill="FFFFFF" w:val="clear"/>
           </w:tcPr>
           <w:p>
             <w:pPr>
@@ -319,11 +297,10 @@
               <w:rPr>
                 <w:rFonts w:ascii="Times New Roman" w:hAnsi="Times New Roman" w:eastAsia="Times New Roman"/>
                 <w:b w:val="0"/>
-                <w:i w:val="0"/>
                 <w:color w:val="5C564E"/>
                 <w:sz w:val="22"/>
               </w:rPr>
-              <w:t>тенге, фиксированная сумма</w:t>
+              <w:t>тенге. Домен и хостинг входят в сумму.</w:t>
             </w:r>
           </w:p>
         </w:tc>
@@ -331,7 +308,6 @@
           <w:tcPr>
             <w:tcW w:type="dxa" w:w="4933"/>
             <w:vAlign w:val="center"/>
-            <w:shd w:fill="FFFFFF" w:val="clear"/>
           </w:tcPr>
           <w:p>
             <w:pPr>
@@ -341,7 +317,6 @@
               <w:rPr>
                 <w:rFonts w:ascii="Times New Roman" w:hAnsi="Times New Roman" w:eastAsia="Times New Roman"/>
                 <w:b w:val="0"/>
-                <w:i w:val="0"/>
                 <w:color w:val="5C564E"/>
                 <w:sz w:val="22"/>
               </w:rPr>
@@ -359,7 +334,6 @@
         <w:rPr>
           <w:rFonts w:ascii="Times New Roman" w:hAnsi="Times New Roman" w:eastAsia="Times New Roman"/>
           <w:b/>
-          <w:i w:val="0"/>
           <w:color w:val="1C1915"/>
           <w:sz w:val="32"/>
         </w:rPr>
@@ -368,13 +342,12 @@
     </w:p>
     <w:p>
       <w:pPr>
-        <w:spacing w:before="0" w:after="160" w:line="259" w:lineRule="auto"/>
+        <w:spacing w:before="0" w:after="120" w:line="259" w:lineRule="auto"/>
       </w:pPr>
       <w:r>
         <w:rPr>
           <w:rFonts w:ascii="Times New Roman" w:hAnsi="Times New Roman" w:eastAsia="Times New Roman"/>
           <w:b w:val="0"/>
-          <w:i w:val="0"/>
           <w:color w:val="1C1915"/>
           <w:sz w:val="24"/>
         </w:rPr>
@@ -389,7 +362,6 @@
         <w:rPr>
           <w:rFonts w:ascii="Times New Roman" w:hAnsi="Times New Roman" w:eastAsia="Times New Roman"/>
           <w:b/>
-          <w:i w:val="0"/>
           <w:color w:val="1C1915"/>
           <w:sz w:val="32"/>
         </w:rPr>
@@ -399,7 +371,6 @@
     <w:tbl>
       <w:tblPr>
         <w:tblW w:type="auto" w:w="0"/>
-        <w:tblLayout w:type="autofit"/>
         <w:tblLook w:firstColumn="1" w:firstRow="1" w:lastColumn="0" w:lastRow="0" w:noHBand="0" w:noVBand="1" w:val="04A0"/>
         <w:tblBorders>
           <w:top w:val="single" w:sz="4" w:space="0" w:color="EEEAE3"/>
@@ -428,7 +399,6 @@
               <w:rPr>
                 <w:rFonts w:ascii="Times New Roman" w:hAnsi="Times New Roman" w:eastAsia="Times New Roman"/>
                 <w:b/>
-                <w:i w:val="0"/>
                 <w:color w:val="0E7490"/>
                 <w:sz w:val="24"/>
               </w:rPr>
@@ -448,7 +418,6 @@
               <w:rPr>
                 <w:rFonts w:ascii="Times New Roman" w:hAnsi="Times New Roman" w:eastAsia="Times New Roman"/>
                 <w:b/>
-                <w:i w:val="0"/>
                 <w:color w:val="1C1915"/>
                 <w:sz w:val="24"/>
               </w:rPr>
@@ -463,7 +432,6 @@
               <w:rPr>
                 <w:rFonts w:ascii="Times New Roman" w:hAnsi="Times New Roman" w:eastAsia="Times New Roman"/>
                 <w:b w:val="0"/>
-                <w:i w:val="0"/>
                 <w:color w:val="5C564E"/>
                 <w:sz w:val="22"/>
               </w:rPr>
@@ -486,7 +454,6 @@
               <w:rPr>
                 <w:rFonts w:ascii="Times New Roman" w:hAnsi="Times New Roman" w:eastAsia="Times New Roman"/>
                 <w:b/>
-                <w:i w:val="0"/>
                 <w:color w:val="0E7490"/>
                 <w:sz w:val="24"/>
               </w:rPr>
@@ -506,7 +473,6 @@
               <w:rPr>
                 <w:rFonts w:ascii="Times New Roman" w:hAnsi="Times New Roman" w:eastAsia="Times New Roman"/>
                 <w:b/>
-                <w:i w:val="0"/>
                 <w:color w:val="1C1915"/>
                 <w:sz w:val="24"/>
               </w:rPr>
@@ -521,11 +487,10 @@
               <w:rPr>
                 <w:rFonts w:ascii="Times New Roman" w:hAnsi="Times New Roman" w:eastAsia="Times New Roman"/>
                 <w:b w:val="0"/>
-                <w:i w:val="0"/>
                 <w:color w:val="5C564E"/>
                 <w:sz w:val="22"/>
               </w:rPr>
-              <w:t>Шесть страниц: лазерная коррекция, катаракта, витрэктомия, косоглазие, глаукома, сетчатка.</w:t>
+              <w:t>Столько страниц, сколько направлений у клиники. Лазер, катаракта, витрэктомия, косоглазие, глаукома и сетчатка — примеры, список не ограничен.</w:t>
             </w:r>
           </w:p>
         </w:tc>
@@ -544,7 +509,6 @@
               <w:rPr>
                 <w:rFonts w:ascii="Times New Roman" w:hAnsi="Times New Roman" w:eastAsia="Times New Roman"/>
                 <w:b/>
-                <w:i w:val="0"/>
                 <w:color w:val="0E7490"/>
                 <w:sz w:val="24"/>
               </w:rPr>
@@ -564,7 +528,6 @@
               <w:rPr>
                 <w:rFonts w:ascii="Times New Roman" w:hAnsi="Times New Roman" w:eastAsia="Times New Roman"/>
                 <w:b/>
-                <w:i w:val="0"/>
                 <w:color w:val="1C1915"/>
                 <w:sz w:val="24"/>
               </w:rPr>
@@ -579,7 +542,6 @@
               <w:rPr>
                 <w:rFonts w:ascii="Times New Roman" w:hAnsi="Times New Roman" w:eastAsia="Times New Roman"/>
                 <w:b w:val="0"/>
-                <w:i w:val="0"/>
                 <w:color w:val="5C564E"/>
                 <w:sz w:val="22"/>
               </w:rPr>
@@ -602,7 +564,6 @@
               <w:rPr>
                 <w:rFonts w:ascii="Times New Roman" w:hAnsi="Times New Roman" w:eastAsia="Times New Roman"/>
                 <w:b/>
-                <w:i w:val="0"/>
                 <w:color w:val="0E7490"/>
                 <w:sz w:val="24"/>
               </w:rPr>
@@ -622,7 +583,6 @@
               <w:rPr>
                 <w:rFonts w:ascii="Times New Roman" w:hAnsi="Times New Roman" w:eastAsia="Times New Roman"/>
                 <w:b/>
-                <w:i w:val="0"/>
                 <w:color w:val="1C1915"/>
                 <w:sz w:val="24"/>
               </w:rPr>
@@ -637,7 +597,6 @@
               <w:rPr>
                 <w:rFonts w:ascii="Times New Roman" w:hAnsi="Times New Roman" w:eastAsia="Times New Roman"/>
                 <w:b w:val="0"/>
-                <w:i w:val="0"/>
                 <w:color w:val="5C564E"/>
                 <w:sz w:val="22"/>
               </w:rPr>
@@ -660,7 +619,6 @@
               <w:rPr>
                 <w:rFonts w:ascii="Times New Roman" w:hAnsi="Times New Roman" w:eastAsia="Times New Roman"/>
                 <w:b/>
-                <w:i w:val="0"/>
                 <w:color w:val="0E7490"/>
                 <w:sz w:val="24"/>
               </w:rPr>
@@ -680,7 +638,6 @@
               <w:rPr>
                 <w:rFonts w:ascii="Times New Roman" w:hAnsi="Times New Roman" w:eastAsia="Times New Roman"/>
                 <w:b/>
-                <w:i w:val="0"/>
                 <w:color w:val="1C1915"/>
                 <w:sz w:val="24"/>
               </w:rPr>
@@ -695,7 +652,6 @@
               <w:rPr>
                 <w:rFonts w:ascii="Times New Roman" w:hAnsi="Times New Roman" w:eastAsia="Times New Roman"/>
                 <w:b w:val="0"/>
-                <w:i w:val="0"/>
                 <w:color w:val="5C564E"/>
                 <w:sz w:val="22"/>
               </w:rPr>
@@ -718,7 +674,6 @@
               <w:rPr>
                 <w:rFonts w:ascii="Times New Roman" w:hAnsi="Times New Roman" w:eastAsia="Times New Roman"/>
                 <w:b/>
-                <w:i w:val="0"/>
                 <w:color w:val="0E7490"/>
                 <w:sz w:val="24"/>
               </w:rPr>
@@ -738,7 +693,6 @@
               <w:rPr>
                 <w:rFonts w:ascii="Times New Roman" w:hAnsi="Times New Roman" w:eastAsia="Times New Roman"/>
                 <w:b/>
-                <w:i w:val="0"/>
                 <w:color w:val="1C1915"/>
                 <w:sz w:val="24"/>
               </w:rPr>
@@ -753,11 +707,65 @@
               <w:rPr>
                 <w:rFonts w:ascii="Times New Roman" w:hAnsi="Times New Roman" w:eastAsia="Times New Roman"/>
                 <w:b w:val="0"/>
-                <w:i w:val="0"/>
                 <w:color w:val="5C564E"/>
                 <w:sz w:val="22"/>
               </w:rPr>
               <w:t>Одна вёрстка на оба экрана, шапка, подвал и уведомление о cookie.</w:t>
+            </w:r>
+          </w:p>
+        </w:tc>
+      </w:tr>
+      <w:tr>
+        <w:tc>
+          <w:tcPr>
+            <w:tcW w:type="dxa" w:w="907"/>
+            <w:vAlign w:val="center"/>
+          </w:tcPr>
+          <w:p>
+            <w:pPr>
+              <w:spacing w:before="40" w:after="40"/>
+            </w:pPr>
+            <w:r>
+              <w:rPr>
+                <w:rFonts w:ascii="Times New Roman" w:hAnsi="Times New Roman" w:eastAsia="Times New Roman"/>
+                <w:b/>
+                <w:color w:val="0E7490"/>
+                <w:sz w:val="24"/>
+              </w:rPr>
+              <w:t>07</w:t>
+            </w:r>
+          </w:p>
+        </w:tc>
+        <w:tc>
+          <w:tcPr>
+            <w:tcW w:type="dxa" w:w="4933"/>
+          </w:tcPr>
+          <w:p>
+            <w:pPr>
+              <w:spacing w:before="60" w:after="20"/>
+            </w:pPr>
+            <w:r>
+              <w:rPr>
+                <w:rFonts w:ascii="Times New Roman" w:hAnsi="Times New Roman" w:eastAsia="Times New Roman"/>
+                <w:b/>
+                <w:color w:val="1C1915"/>
+                <w:sz w:val="24"/>
+              </w:rPr>
+              <w:t>Домен и хостинг</w:t>
+            </w:r>
+          </w:p>
+          <w:p>
+            <w:pPr>
+              <w:spacing w:before="0" w:after="60"/>
+            </w:pPr>
+            <w:r>
+              <w:rPr>
+                <w:rFonts w:ascii="Times New Roman" w:hAnsi="Times New Roman" w:eastAsia="Times New Roman"/>
+                <w:b w:val="0"/>
+                <w:color w:val="5C564E"/>
+                <w:sz w:val="22"/>
+              </w:rPr>
+              <w:t>Регистрация домена и размещение сайта входят в 200 000 тенге.</w:t>
             </w:r>
           </w:p>
         </w:tc>
@@ -771,7 +779,6 @@
         <w:rPr>
           <w:rFonts w:ascii="Times New Roman" w:hAnsi="Times New Roman" w:eastAsia="Times New Roman"/>
           <w:b/>
-          <w:i w:val="0"/>
           <w:color w:val="1C1915"/>
           <w:sz w:val="32"/>
         </w:rPr>
@@ -809,7 +816,6 @@
               <w:rPr>
                 <w:rFonts w:ascii="Times New Roman" w:hAnsi="Times New Roman" w:eastAsia="Times New Roman"/>
                 <w:b/>
-                <w:i w:val="0"/>
                 <w:color w:val="8A8378"/>
                 <w:sz w:val="22"/>
               </w:rPr>
@@ -830,7 +836,6 @@
               <w:rPr>
                 <w:rFonts w:ascii="Times New Roman" w:hAnsi="Times New Roman" w:eastAsia="Times New Roman"/>
                 <w:b/>
-                <w:i w:val="0"/>
                 <w:color w:val="8A8378"/>
                 <w:sz w:val="22"/>
               </w:rPr>
@@ -853,7 +858,6 @@
               <w:rPr>
                 <w:rFonts w:ascii="Times New Roman" w:hAnsi="Times New Roman" w:eastAsia="Times New Roman"/>
                 <w:b/>
-                <w:i w:val="0"/>
                 <w:color w:val="1C1915"/>
                 <w:sz w:val="22"/>
               </w:rPr>
@@ -874,7 +878,6 @@
               <w:rPr>
                 <w:rFonts w:ascii="Times New Roman" w:hAnsi="Times New Roman" w:eastAsia="Times New Roman"/>
                 <w:b w:val="0"/>
-                <w:i w:val="0"/>
                 <w:color w:val="1C1915"/>
                 <w:sz w:val="22"/>
               </w:rPr>
@@ -897,7 +900,6 @@
               <w:rPr>
                 <w:rFonts w:ascii="Times New Roman" w:hAnsi="Times New Roman" w:eastAsia="Times New Roman"/>
                 <w:b/>
-                <w:i w:val="0"/>
                 <w:color w:val="1C1915"/>
                 <w:sz w:val="22"/>
               </w:rPr>
@@ -918,7 +920,6 @@
               <w:rPr>
                 <w:rFonts w:ascii="Times New Roman" w:hAnsi="Times New Roman" w:eastAsia="Times New Roman"/>
                 <w:b w:val="0"/>
-                <w:i w:val="0"/>
                 <w:color w:val="1C1915"/>
                 <w:sz w:val="22"/>
               </w:rPr>
@@ -941,7 +942,6 @@
               <w:rPr>
                 <w:rFonts w:ascii="Times New Roman" w:hAnsi="Times New Roman" w:eastAsia="Times New Roman"/>
                 <w:b/>
-                <w:i w:val="0"/>
                 <w:color w:val="1C1915"/>
                 <w:sz w:val="22"/>
               </w:rPr>
@@ -962,7 +962,6 @@
               <w:rPr>
                 <w:rFonts w:ascii="Times New Roman" w:hAnsi="Times New Roman" w:eastAsia="Times New Roman"/>
                 <w:b w:val="0"/>
-                <w:i w:val="0"/>
                 <w:color w:val="1C1915"/>
                 <w:sz w:val="22"/>
               </w:rPr>
@@ -980,7 +979,6 @@
         <w:rPr>
           <w:rFonts w:ascii="Times New Roman" w:hAnsi="Times New Roman" w:eastAsia="Times New Roman"/>
           <w:b w:val="0"/>
-          <w:i w:val="0"/>
           <w:color w:val="5C564E"/>
           <w:sz w:val="22"/>
         </w:rPr>
@@ -995,7 +993,6 @@
         <w:rPr>
           <w:rFonts w:ascii="Times New Roman" w:hAnsi="Times New Roman" w:eastAsia="Times New Roman"/>
           <w:b/>
-          <w:i w:val="0"/>
           <w:color w:val="1C1915"/>
           <w:sz w:val="32"/>
         </w:rPr>
@@ -1033,11 +1030,10 @@
               <w:rPr>
                 <w:rFonts w:ascii="Times New Roman" w:hAnsi="Times New Roman" w:eastAsia="Times New Roman"/>
                 <w:b w:val="0"/>
-                <w:i w:val="0"/>
                 <w:color w:val="1C1915"/>
                 <w:sz w:val="24"/>
               </w:rPr>
-              <w:t>Сайт офтальмологической клиники в Алматы, состав выше</w:t>
+              <w:t>Сайт офтальмологической клиники в Алматы, состав выше, домен и хостинг</w:t>
             </w:r>
           </w:p>
         </w:tc>
@@ -1055,7 +1051,6 @@
               <w:rPr>
                 <w:rFonts w:ascii="Times New Roman" w:hAnsi="Times New Roman" w:eastAsia="Times New Roman"/>
                 <w:b/>
-                <w:i w:val="0"/>
                 <w:color w:val="1C1915"/>
                 <w:sz w:val="24"/>
               </w:rPr>
@@ -1078,7 +1073,6 @@
               <w:rPr>
                 <w:rFonts w:ascii="Times New Roman" w:hAnsi="Times New Roman" w:eastAsia="Times New Roman"/>
                 <w:b/>
-                <w:i w:val="0"/>
                 <w:color w:val="1C1915"/>
                 <w:sz w:val="24"/>
               </w:rPr>
@@ -1100,7 +1094,6 @@
               <w:rPr>
                 <w:rFonts w:ascii="Times New Roman" w:hAnsi="Times New Roman" w:eastAsia="Times New Roman"/>
                 <w:b/>
-                <w:i w:val="0"/>
                 <w:color w:val="1C1915"/>
                 <w:sz w:val="28"/>
               </w:rPr>
@@ -1118,11 +1111,10 @@
         <w:rPr>
           <w:rFonts w:ascii="Times New Roman" w:hAnsi="Times New Roman" w:eastAsia="Times New Roman"/>
           <w:b w:val="0"/>
-          <w:i w:val="0"/>
           <w:color w:val="5C564E"/>
           <w:sz w:val="22"/>
         </w:rPr>
-        <w:t>Оплата в день старта. Домен, хостинг и реклама в эти 200 000 тенге не входят.</w:t>
+        <w:t>Оплата в день старта. Домен и хостинг входят в сумму. Реклама оплачивается отдельно.</w:t>
       </w:r>
     </w:p>
     <w:p>
@@ -1133,7 +1125,6 @@
         <w:rPr>
           <w:rFonts w:ascii="Times New Roman" w:hAnsi="Times New Roman" w:eastAsia="Times New Roman"/>
           <w:b/>
-          <w:i w:val="0"/>
           <w:color w:val="1C1915"/>
           <w:sz w:val="32"/>
         </w:rPr>
@@ -1148,7 +1139,6 @@
         <w:rPr>
           <w:rFonts w:ascii="Times New Roman" w:hAnsi="Times New Roman" w:eastAsia="Times New Roman"/>
           <w:b w:val="0"/>
-          <w:i w:val="0"/>
           <w:color w:val="1C1915"/>
           <w:sz w:val="24"/>
         </w:rPr>
@@ -1163,7 +1153,6 @@
         <w:rPr>
           <w:rFonts w:ascii="Times New Roman" w:hAnsi="Times New Roman" w:eastAsia="Times New Roman"/>
           <w:b w:val="0"/>
-          <w:i w:val="0"/>
           <w:color w:val="1C1915"/>
           <w:sz w:val="24"/>
         </w:rPr>
@@ -1178,7 +1167,6 @@
         <w:rPr>
           <w:rFonts w:ascii="Times New Roman" w:hAnsi="Times New Roman" w:eastAsia="Times New Roman"/>
           <w:b w:val="0"/>
-          <w:i w:val="0"/>
           <w:color w:val="1C1915"/>
           <w:sz w:val="24"/>
         </w:rPr>
@@ -1193,7 +1181,6 @@
         <w:rPr>
           <w:rFonts w:ascii="Times New Roman" w:hAnsi="Times New Roman" w:eastAsia="Times New Roman"/>
           <w:b w:val="0"/>
-          <w:i w:val="0"/>
           <w:color w:val="1C1915"/>
           <w:sz w:val="24"/>
         </w:rPr>
@@ -1208,7 +1195,6 @@
         <w:rPr>
           <w:rFonts w:ascii="Times New Roman" w:hAnsi="Times New Roman" w:eastAsia="Times New Roman"/>
           <w:b/>
-          <w:i w:val="0"/>
           <w:color w:val="1C1915"/>
           <w:sz w:val="32"/>
         </w:rPr>
@@ -1223,11 +1209,10 @@
         <w:rPr>
           <w:rFonts w:ascii="Times New Roman" w:hAnsi="Times New Roman" w:eastAsia="Times New Roman"/>
           <w:b w:val="0"/>
-          <w:i w:val="0"/>
           <w:color w:val="1C1915"/>
           <w:sz w:val="24"/>
         </w:rPr>
-        <w:t>Сайт принят, когда страницы из состава открываются, кнопка WhatsApp ведёт на номер клиники, а адрес и часы Алматы совпадают с переданными. Предложение действует 14 дней, до 12 ноября 2026.</w:t>
+        <w:t>Сайт принят, когда страницы из состава открываются, кнопка WhatsApp ведёт на номер клиники, а адрес и часы Алматы совпадают с переданными. Домен открывается, сайт размещён на хостинге. Предложение действует 14 дней, до 12 ноября 2026.</w:t>
       </w:r>
     </w:p>
     <w:p>
@@ -1269,7 +1254,6 @@
               <w:rPr>
                 <w:rFonts w:ascii="Times New Roman" w:hAnsi="Times New Roman" w:eastAsia="Times New Roman"/>
                 <w:b/>
-                <w:i w:val="0"/>
                 <w:color w:val="8A8378"/>
                 <w:sz w:val="20"/>
               </w:rPr>
@@ -1290,7 +1274,6 @@
               <w:rPr>
                 <w:rFonts w:ascii="Times New Roman" w:hAnsi="Times New Roman" w:eastAsia="Times New Roman"/>
                 <w:b/>
-                <w:i w:val="0"/>
                 <w:color w:val="8A8378"/>
                 <w:sz w:val="20"/>
               </w:rPr>
@@ -1313,7 +1296,6 @@
               <w:rPr>
                 <w:rFonts w:ascii="Times New Roman" w:hAnsi="Times New Roman" w:eastAsia="Times New Roman"/>
                 <w:b w:val="0"/>
-                <w:i w:val="0"/>
                 <w:color w:val="1C1915"/>
                 <w:sz w:val="24"/>
               </w:rPr>
@@ -1334,7 +1316,6 @@
               <w:rPr>
                 <w:rFonts w:ascii="Times New Roman" w:hAnsi="Times New Roman" w:eastAsia="Times New Roman"/>
                 <w:b w:val="0"/>
-                <w:i w:val="0"/>
                 <w:color w:val="1C1915"/>
                 <w:sz w:val="24"/>
               </w:rPr>
@@ -1359,7 +1340,6 @@
               <w:rPr>
                 <w:rFonts w:ascii="Times New Roman" w:hAnsi="Times New Roman" w:eastAsia="Times New Roman"/>
                 <w:b w:val="0"/>
-                <w:i w:val="0"/>
                 <w:color w:val="8A8378"/>
                 <w:sz w:val="20"/>
               </w:rPr>
@@ -1382,7 +1362,6 @@
               <w:rPr>
                 <w:rFonts w:ascii="Times New Roman" w:hAnsi="Times New Roman" w:eastAsia="Times New Roman"/>
                 <w:b w:val="0"/>
-                <w:i w:val="0"/>
                 <w:color w:val="8A8378"/>
                 <w:sz w:val="20"/>
               </w:rPr>
@@ -1421,7 +1400,6 @@
               <w:rPr>
                 <w:rFonts w:ascii="Times New Roman" w:hAnsi="Times New Roman" w:eastAsia="Times New Roman"/>
                 <w:b w:val="0"/>
-                <w:i w:val="0"/>
                 <w:color w:val="8A8378"/>
                 <w:sz w:val="20"/>
               </w:rPr>
@@ -1444,7 +1422,6 @@
               <w:rPr>
                 <w:rFonts w:ascii="Times New Roman" w:hAnsi="Times New Roman" w:eastAsia="Times New Roman"/>
                 <w:b w:val="0"/>
-                <w:i w:val="0"/>
                 <w:color w:val="8A8378"/>
                 <w:sz w:val="20"/>
               </w:rPr>

</xml_diff>